<commit_message>
Validação de email e senha através de uma função JavaScript, com mensagem de erro e alerta de sucesso. Autocomplete do campo email desligado.
</commit_message>
<xml_diff>
--- a/Tarefa1_TelaDeLogin.docx
+++ b/Tarefa1_TelaDeLogin.docx
@@ -33,6 +33,84 @@
       <w:proofErr w:type="spellEnd"/>
       <w:r>
         <w:t>. O seguinte comportamento deve ser observado:</w:t>
+      </w:r>
+    </w:p>
+    <w:p>
+      <w:pPr>
+        <w:pStyle w:val="PargrafodaLista"/>
+        <w:numPr>
+          <w:ilvl w:val="0"/>
+          <w:numId w:val="1"/>
+        </w:numPr>
+        <w:rPr>
+          <w:highlight w:val="darkGray"/>
+        </w:rPr>
+      </w:pPr>
+      <w:r>
+        <w:rPr>
+          <w:highlight w:val="darkGray"/>
+        </w:rPr>
+        <w:t xml:space="preserve">O campo </w:t>
+      </w:r>
+      <w:proofErr w:type="spellStart"/>
+      <w:r>
+        <w:rPr>
+          <w:highlight w:val="darkGray"/>
+        </w:rPr>
+        <w:t>email</w:t>
+      </w:r>
+      <w:proofErr w:type="spellEnd"/>
+      <w:r>
+        <w:rPr>
+          <w:highlight w:val="darkGray"/>
+        </w:rPr>
+        <w:t xml:space="preserve"> deve verificar o </w:t>
+      </w:r>
+      <w:proofErr w:type="spellStart"/>
+      <w:r>
+        <w:rPr>
+          <w:highlight w:val="darkGray"/>
+        </w:rPr>
+        <w:t>email</w:t>
+      </w:r>
+      <w:proofErr w:type="spellEnd"/>
+      <w:r>
+        <w:rPr>
+          <w:highlight w:val="darkGray"/>
+        </w:rPr>
+        <w:t xml:space="preserve"> está no formato adequado (no caso, verificando se o </w:t>
+      </w:r>
+      <w:proofErr w:type="spellStart"/>
+      <w:r>
+        <w:rPr>
+          <w:highlight w:val="darkGray"/>
+        </w:rPr>
+        <w:t>email</w:t>
+      </w:r>
+      <w:proofErr w:type="spellEnd"/>
+      <w:r>
+        <w:rPr>
+          <w:highlight w:val="darkGray"/>
+        </w:rPr>
+        <w:t xml:space="preserve"> o válido).</w:t>
+      </w:r>
+    </w:p>
+    <w:p>
+      <w:pPr>
+        <w:pStyle w:val="PargrafodaLista"/>
+        <w:numPr>
+          <w:ilvl w:val="0"/>
+          <w:numId w:val="1"/>
+        </w:numPr>
+        <w:rPr>
+          <w:highlight w:val="darkGray"/>
+        </w:rPr>
+      </w:pPr>
+      <w:r>
+        <w:rPr>
+          <w:highlight w:val="darkGray"/>
+        </w:rPr>
+        <w:t>O campo senha, ao ser digitado, deve aparecer sombreado (não aparecer os valores, apenas asteriscos).</w:t>
       </w:r>
     </w:p>
     <w:p>
@@ -44,88 +122,59 @@
         </w:numPr>
       </w:pPr>
       <w:r>
-        <w:t xml:space="preserve">O campo </w:t>
+        <w:rPr>
+          <w:highlight w:val="darkGray"/>
+        </w:rPr>
+        <w:t xml:space="preserve">Ao clicar em Entrar, o sistema verifica se o </w:t>
       </w:r>
       <w:proofErr w:type="spellStart"/>
       <w:r>
+        <w:rPr>
+          <w:highlight w:val="darkGray"/>
+        </w:rPr>
         <w:t>email</w:t>
       </w:r>
       <w:proofErr w:type="spellEnd"/>
       <w:r>
-        <w:t xml:space="preserve"> deve verificar o </w:t>
-      </w:r>
-      <w:proofErr w:type="spellStart"/>
-      <w:r>
-        <w:t>email</w:t>
-      </w:r>
-      <w:proofErr w:type="spellEnd"/>
-      <w:r>
-        <w:t xml:space="preserve"> está no formato adequado (no caso, verificando se o </w:t>
-      </w:r>
-      <w:proofErr w:type="spellStart"/>
-      <w:r>
-        <w:t>email</w:t>
-      </w:r>
-      <w:proofErr w:type="spellEnd"/>
-      <w:r>
-        <w:t xml:space="preserve"> o válido).</w:t>
-      </w:r>
-    </w:p>
-    <w:p>
-      <w:pPr>
-        <w:pStyle w:val="PargrafodaLista"/>
-        <w:numPr>
-          <w:ilvl w:val="0"/>
-          <w:numId w:val="1"/>
-        </w:numPr>
-        <w:rPr>
-          <w:highlight w:val="darkGray"/>
-        </w:rPr>
-      </w:pPr>
-      <w:r>
-        <w:rPr>
-          <w:highlight w:val="darkGray"/>
-        </w:rPr>
-        <w:t>O campo senha, ao ser digitado, deve aparecer sombreado (não aparecer os valores, apenas asteriscos).</w:t>
-      </w:r>
-    </w:p>
-    <w:p>
-      <w:pPr>
-        <w:pStyle w:val="PargrafodaLista"/>
-        <w:numPr>
-          <w:ilvl w:val="0"/>
-          <w:numId w:val="1"/>
-        </w:numPr>
-      </w:pPr>
-      <w:r>
-        <w:t xml:space="preserve">Ao clicar em Entrar, o sistema verifica se o </w:t>
-      </w:r>
-      <w:proofErr w:type="spellStart"/>
-      <w:r>
-        <w:t>email</w:t>
-      </w:r>
-      <w:proofErr w:type="spellEnd"/>
-      <w:r>
+        <w:rPr>
+          <w:highlight w:val="darkGray"/>
+        </w:rPr>
         <w:t xml:space="preserve"> é </w:t>
       </w:r>
       <w:hyperlink r:id="rId6" w:history="1">
         <w:r>
           <w:rPr>
             <w:rStyle w:val="Hyperlink"/>
+            <w:highlight w:val="darkGray"/>
           </w:rPr>
           <w:t>test@mail.com</w:t>
         </w:r>
       </w:hyperlink>
       <w:r>
+        <w:rPr>
+          <w:highlight w:val="darkGray"/>
+        </w:rPr>
         <w:t xml:space="preserve"> e a senha é “senha”. Caso os dados coincidam com isso, o usuário é levado ao seu dashboard inicial (apenas imprime um </w:t>
       </w:r>
       <w:proofErr w:type="spellStart"/>
       <w:r>
+        <w:rPr>
+          <w:highlight w:val="darkGray"/>
+        </w:rPr>
         <w:t>alert</w:t>
       </w:r>
       <w:proofErr w:type="spellEnd"/>
       <w:r>
-        <w:t xml:space="preserve"> dizendo que em breve o dashboard será disponibilizado). Caso os dados não existam, é apresentada uma mensagem de erro indicando “Usuário ou senha inválido. Caso não seja cadastrado, crie uma conta!”.</w:t>
+        <w:rPr>
+          <w:highlight w:val="darkGray"/>
+        </w:rPr>
+        <w:t xml:space="preserve"> dizendo que em breve o dashboard será disponibilizado</w:t>
+      </w:r>
+      <w:r>
+        <w:rPr>
+          <w:highlight w:val="darkGray"/>
+        </w:rPr>
+        <w:t>). Caso os dados não existam, é apresentada uma mensagem de erro indicando “Usuário ou senha inválido. Caso não seja cadastrado, crie uma conta!”.</w:t>
       </w:r>
     </w:p>
     <w:p>

</xml_diff>